<commit_message>
fix(sptjm): update 2026 template preparation script and test suite
- Refresh public/templates/sptjm-2026.docx via prepare_sptjm_template.py
- Update tests/sptjm.test.js to validate updated template placeholders and document generation
</commit_message>
<xml_diff>
--- a/public/templates/sptjm-2026.docx
+++ b/public/templates/sptjm-2026.docx
@@ -49,7 +49,7 @@
     </w:p>
     <w:p>
       <w:pPr>
-        <w:spacing w:after="0" w:line="360" w:lineRule="auto"/>
+        <w:spacing w:after="240" w:line="360" w:lineRule="auto"/>
         <w:jc w:val="both"/>
         <w:rPr>
           <w:rFonts w:ascii="Bookman Old Style" w:eastAsia="Bookman Old Style" w:hAnsi="Bookman Old Style" w:cs="Bookman Old Style"/>
@@ -66,373 +66,714 @@
         <w:t>Yang bertanda tangan dibawah ini :</w:t>
       </w:r>
     </w:p>
-    <w:p>
-      <w:pPr>
-        <w:spacing w:before="240" w:after="0" w:line="360" w:lineRule="auto"/>
-        <w:jc w:val="both"/>
-        <w:rPr>
-          <w:rFonts w:ascii="Bookman Old Style" w:eastAsia="Bookman Old Style" w:hAnsi="Bookman Old Style" w:cs="Bookman Old Style"/>
-          <w:sz w:val="24"/>
-          <w:szCs w:val="24"/>
-        </w:rPr>
-      </w:pPr>
-      <w:r>
-        <w:rPr>
-          <w:rFonts w:ascii="Bookman Old Style" w:eastAsia="Bookman Old Style" w:hAnsi="Bookman Old Style" w:cs="Bookman Old Style"/>
-          <w:sz w:val="24"/>
-          <w:szCs w:val="24"/>
-        </w:rPr>
-        <w:t>Nama</w:t>
-      </w:r>
-      <w:r>
-        <w:rPr>
-          <w:rFonts w:ascii="Bookman Old Style" w:eastAsia="Bookman Old Style" w:hAnsi="Bookman Old Style" w:cs="Bookman Old Style"/>
-          <w:sz w:val="24"/>
-          <w:szCs w:val="24"/>
-        </w:rPr>
-        <w:tab/>
-      </w:r>
-      <w:r>
-        <w:rPr>
-          <w:rFonts w:ascii="Bookman Old Style" w:eastAsia="Bookman Old Style" w:hAnsi="Bookman Old Style" w:cs="Bookman Old Style"/>
-          <w:sz w:val="24"/>
-          <w:szCs w:val="24"/>
-        </w:rPr>
-        <w:tab/>
-      </w:r>
-      <w:r>
-        <w:rPr>
-          <w:rFonts w:ascii="Bookman Old Style" w:eastAsia="Bookman Old Style" w:hAnsi="Bookman Old Style" w:cs="Bookman Old Style"/>
-          <w:sz w:val="24"/>
-          <w:szCs w:val="24"/>
-        </w:rPr>
-        <w:tab/>
-      </w:r>
-      <w:r>
-        <w:rPr>
-          <w:rFonts w:ascii="Bookman Old Style" w:eastAsia="Bookman Old Style" w:hAnsi="Bookman Old Style" w:cs="Bookman Old Style"/>
-          <w:sz w:val="24"/>
-          <w:szCs w:val="24"/>
-        </w:rPr>
-        <w:tab/>
-        <w:t>: {nama}</w:t>
-      </w:r>
-    </w:p>
-    <w:p>
-      <w:pPr>
-        <w:spacing w:after="0" w:line="360" w:lineRule="auto"/>
-        <w:jc w:val="both"/>
-        <w:rPr>
-          <w:rFonts w:ascii="Bookman Old Style" w:eastAsia="Bookman Old Style" w:hAnsi="Bookman Old Style" w:cs="Bookman Old Style"/>
-          <w:sz w:val="24"/>
-          <w:szCs w:val="24"/>
-        </w:rPr>
-      </w:pPr>
-      <w:r>
-        <w:rPr>
-          <w:rFonts w:ascii="Bookman Old Style" w:eastAsia="Bookman Old Style" w:hAnsi="Bookman Old Style" w:cs="Bookman Old Style"/>
-          <w:sz w:val="24"/>
-          <w:szCs w:val="24"/>
-        </w:rPr>
-        <w:t>NIP</w:t>
-      </w:r>
-      <w:r>
-        <w:rPr>
-          <w:rFonts w:ascii="Bookman Old Style" w:eastAsia="Bookman Old Style" w:hAnsi="Bookman Old Style" w:cs="Bookman Old Style"/>
-          <w:sz w:val="24"/>
-          <w:szCs w:val="24"/>
-        </w:rPr>
-        <w:tab/>
-      </w:r>
-      <w:r>
-        <w:rPr>
-          <w:rFonts w:ascii="Bookman Old Style" w:eastAsia="Bookman Old Style" w:hAnsi="Bookman Old Style" w:cs="Bookman Old Style"/>
-          <w:sz w:val="24"/>
-          <w:szCs w:val="24"/>
-        </w:rPr>
-        <w:tab/>
-      </w:r>
-      <w:r>
-        <w:rPr>
-          <w:rFonts w:ascii="Bookman Old Style" w:eastAsia="Bookman Old Style" w:hAnsi="Bookman Old Style" w:cs="Bookman Old Style"/>
-          <w:sz w:val="24"/>
-          <w:szCs w:val="24"/>
-        </w:rPr>
-        <w:tab/>
-      </w:r>
-      <w:r>
-        <w:rPr>
-          <w:rFonts w:ascii="Bookman Old Style" w:eastAsia="Bookman Old Style" w:hAnsi="Bookman Old Style" w:cs="Bookman Old Style"/>
-          <w:sz w:val="24"/>
-          <w:szCs w:val="24"/>
-        </w:rPr>
-        <w:tab/>
-        <w:t>: {nip}</w:t>
-      </w:r>
-    </w:p>
-    <w:p>
-      <w:pPr>
-        <w:spacing w:after="0" w:line="360" w:lineRule="auto"/>
-        <w:jc w:val="both"/>
-        <w:rPr>
-          <w:rFonts w:ascii="Bookman Old Style" w:eastAsia="Bookman Old Style" w:hAnsi="Bookman Old Style" w:cs="Bookman Old Style"/>
-          <w:sz w:val="24"/>
-          <w:szCs w:val="24"/>
-        </w:rPr>
-      </w:pPr>
-      <w:r>
-        <w:rPr>
-          <w:rFonts w:ascii="Bookman Old Style" w:eastAsia="Bookman Old Style" w:hAnsi="Bookman Old Style" w:cs="Bookman Old Style"/>
-          <w:sz w:val="24"/>
-          <w:szCs w:val="24"/>
-        </w:rPr>
-        <w:t>NIK</w:t>
-      </w:r>
-      <w:r>
-        <w:rPr>
-          <w:rFonts w:ascii="Bookman Old Style" w:eastAsia="Bookman Old Style" w:hAnsi="Bookman Old Style" w:cs="Bookman Old Style"/>
-          <w:sz w:val="24"/>
-          <w:szCs w:val="24"/>
-        </w:rPr>
-        <w:tab/>
-      </w:r>
-      <w:r>
-        <w:rPr>
-          <w:rFonts w:ascii="Bookman Old Style" w:eastAsia="Bookman Old Style" w:hAnsi="Bookman Old Style" w:cs="Bookman Old Style"/>
-          <w:sz w:val="24"/>
-          <w:szCs w:val="24"/>
-        </w:rPr>
-        <w:tab/>
-      </w:r>
-      <w:r>
-        <w:rPr>
-          <w:rFonts w:ascii="Bookman Old Style" w:eastAsia="Bookman Old Style" w:hAnsi="Bookman Old Style" w:cs="Bookman Old Style"/>
-          <w:sz w:val="24"/>
-          <w:szCs w:val="24"/>
-        </w:rPr>
-        <w:tab/>
-      </w:r>
-      <w:r>
-        <w:rPr>
-          <w:rFonts w:ascii="Bookman Old Style" w:eastAsia="Bookman Old Style" w:hAnsi="Bookman Old Style" w:cs="Bookman Old Style"/>
-          <w:sz w:val="24"/>
-          <w:szCs w:val="24"/>
-        </w:rPr>
-        <w:tab/>
-        <w:t>: {nik}</w:t>
-      </w:r>
-    </w:p>
-    <w:p>
-      <w:pPr>
-        <w:spacing w:after="0" w:line="360" w:lineRule="auto"/>
-        <w:jc w:val="both"/>
-        <w:rPr>
-          <w:rFonts w:ascii="Bookman Old Style" w:eastAsia="Bookman Old Style" w:hAnsi="Bookman Old Style" w:cs="Bookman Old Style"/>
-          <w:sz w:val="24"/>
-          <w:szCs w:val="24"/>
-        </w:rPr>
-      </w:pPr>
-      <w:r>
-        <w:rPr>
-          <w:rFonts w:ascii="Bookman Old Style" w:eastAsia="Bookman Old Style" w:hAnsi="Bookman Old Style" w:cs="Bookman Old Style"/>
-          <w:sz w:val="24"/>
-          <w:szCs w:val="24"/>
-        </w:rPr>
-        <w:t>Jabatan</w:t>
-      </w:r>
-      <w:r>
-        <w:rPr>
-          <w:rFonts w:ascii="Bookman Old Style" w:eastAsia="Bookman Old Style" w:hAnsi="Bookman Old Style" w:cs="Bookman Old Style"/>
-          <w:sz w:val="24"/>
-          <w:szCs w:val="24"/>
-        </w:rPr>
-        <w:tab/>
-      </w:r>
-      <w:r>
-        <w:rPr>
-          <w:rFonts w:ascii="Bookman Old Style" w:eastAsia="Bookman Old Style" w:hAnsi="Bookman Old Style" w:cs="Bookman Old Style"/>
-          <w:sz w:val="24"/>
-          <w:szCs w:val="24"/>
-        </w:rPr>
-        <w:tab/>
-      </w:r>
-      <w:r>
-        <w:rPr>
-          <w:rFonts w:ascii="Bookman Old Style" w:eastAsia="Bookman Old Style" w:hAnsi="Bookman Old Style" w:cs="Bookman Old Style"/>
-          <w:sz w:val="24"/>
-          <w:szCs w:val="24"/>
-        </w:rPr>
-        <w:tab/>
-        <w:t>: {jabatan}</w:t>
-      </w:r>
-    </w:p>
-    <w:p>
-      <w:pPr>
-        <w:spacing w:after="0" w:line="360" w:lineRule="auto"/>
-        <w:jc w:val="both"/>
-        <w:rPr>
-          <w:rFonts w:ascii="Bookman Old Style" w:eastAsia="Bookman Old Style" w:hAnsi="Bookman Old Style" w:cs="Bookman Old Style"/>
-          <w:sz w:val="24"/>
-          <w:szCs w:val="24"/>
-        </w:rPr>
-      </w:pPr>
-      <w:r>
-        <w:rPr>
-          <w:rFonts w:ascii="Bookman Old Style" w:eastAsia="Bookman Old Style" w:hAnsi="Bookman Old Style" w:cs="Bookman Old Style"/>
-          <w:sz w:val="24"/>
-          <w:szCs w:val="24"/>
-        </w:rPr>
-        <w:t>Unit</w:t>
-      </w:r>
-      <w:r>
-        <w:rPr>
-          <w:rFonts w:ascii="Bookman Old Style" w:eastAsia="Bookman Old Style" w:hAnsi="Bookman Old Style" w:cs="Bookman Old Style"/>
-          <w:sz w:val="24"/>
-          <w:szCs w:val="24"/>
-        </w:rPr>
-        <w:t xml:space="preserve"> Kerja</w:t>
-      </w:r>
-      <w:r>
-        <w:rPr>
-          <w:rFonts w:ascii="Bookman Old Style" w:eastAsia="Bookman Old Style" w:hAnsi="Bookman Old Style" w:cs="Bookman Old Style"/>
-          <w:sz w:val="24"/>
-          <w:szCs w:val="24"/>
-        </w:rPr>
-        <w:tab/>
-      </w:r>
-      <w:r>
-        <w:rPr>
-          <w:rFonts w:ascii="Bookman Old Style" w:eastAsia="Bookman Old Style" w:hAnsi="Bookman Old Style" w:cs="Bookman Old Style"/>
-          <w:sz w:val="24"/>
-          <w:szCs w:val="24"/>
-        </w:rPr>
-        <w:tab/>
-      </w:r>
-      <w:r>
-        <w:rPr>
-          <w:rFonts w:ascii="Bookman Old Style" w:eastAsia="Bookman Old Style" w:hAnsi="Bookman Old Style" w:cs="Bookman Old Style"/>
-          <w:sz w:val="24"/>
-          <w:szCs w:val="24"/>
-        </w:rPr>
-        <w:tab/>
-      </w:r>
-      <w:r>
-        <w:rPr>
-          <w:rFonts w:ascii="Bookman Old Style" w:eastAsia="Bookman Old Style" w:hAnsi="Bookman Old Style" w:cs="Bookman Old Style"/>
-          <w:sz w:val="24"/>
-          <w:szCs w:val="24"/>
-        </w:rPr>
-        <w:t>: {unitKerja}</w:t>
-      </w:r>
-    </w:p>
-    <w:p>
-      <w:pPr>
-        <w:spacing w:after="0" w:line="360" w:lineRule="auto"/>
-        <w:jc w:val="both"/>
-        <w:rPr>
-          <w:rFonts w:ascii="Bookman Old Style" w:eastAsia="Bookman Old Style" w:hAnsi="Bookman Old Style" w:cs="Bookman Old Style"/>
-          <w:sz w:val="24"/>
-          <w:szCs w:val="24"/>
-        </w:rPr>
-      </w:pPr>
-      <w:r>
-        <w:rPr>
-          <w:rFonts w:ascii="Bookman Old Style" w:eastAsia="Bookman Old Style" w:hAnsi="Bookman Old Style" w:cs="Bookman Old Style"/>
-          <w:sz w:val="24"/>
-          <w:szCs w:val="24"/>
-        </w:rPr>
-        <w:t>Provinsi</w:t>
-      </w:r>
-      <w:r>
-        <w:rPr>
-          <w:rFonts w:ascii="Bookman Old Style" w:eastAsia="Bookman Old Style" w:hAnsi="Bookman Old Style" w:cs="Bookman Old Style"/>
-          <w:sz w:val="24"/>
-          <w:szCs w:val="24"/>
-        </w:rPr>
-        <w:tab/>
-      </w:r>
-      <w:r>
-        <w:rPr>
-          <w:rFonts w:ascii="Bookman Old Style" w:eastAsia="Bookman Old Style" w:hAnsi="Bookman Old Style" w:cs="Bookman Old Style"/>
-          <w:sz w:val="24"/>
-          <w:szCs w:val="24"/>
-        </w:rPr>
-        <w:tab/>
-      </w:r>
-      <w:r>
-        <w:rPr>
-          <w:rFonts w:ascii="Bookman Old Style" w:eastAsia="Bookman Old Style" w:hAnsi="Bookman Old Style" w:cs="Bookman Old Style"/>
-          <w:sz w:val="24"/>
-          <w:szCs w:val="24"/>
-        </w:rPr>
-        <w:tab/>
-        <w:t xml:space="preserve">: {provinsi}</w:t>
-      </w:r>
-    </w:p>
-    <w:p>
-      <w:pPr>
-        <w:spacing w:after="0" w:line="360" w:lineRule="auto"/>
-        <w:jc w:val="both"/>
-        <w:rPr>
-          <w:rFonts w:ascii="Bookman Old Style" w:eastAsia="Bookman Old Style" w:hAnsi="Bookman Old Style" w:cs="Bookman Old Style"/>
-          <w:sz w:val="24"/>
-          <w:szCs w:val="24"/>
-        </w:rPr>
-      </w:pPr>
-      <w:r>
-        <w:rPr>
-          <w:rFonts w:ascii="Bookman Old Style" w:eastAsia="Bookman Old Style" w:hAnsi="Bookman Old Style" w:cs="Bookman Old Style"/>
-          <w:sz w:val="24"/>
-          <w:szCs w:val="24"/>
-        </w:rPr>
-        <w:t>Kabupaten/Kota</w:t>
-      </w:r>
-      <w:r>
-        <w:rPr>
-          <w:rFonts w:ascii="Bookman Old Style" w:eastAsia="Bookman Old Style" w:hAnsi="Bookman Old Style" w:cs="Bookman Old Style"/>
-          <w:sz w:val="24"/>
-          <w:szCs w:val="24"/>
-        </w:rPr>
-        <w:tab/>
-      </w:r>
-      <w:r>
-        <w:rPr>
-          <w:rFonts w:ascii="Bookman Old Style" w:eastAsia="Bookman Old Style" w:hAnsi="Bookman Old Style" w:cs="Bookman Old Style"/>
-          <w:sz w:val="24"/>
-          <w:szCs w:val="24"/>
-        </w:rPr>
-        <w:tab/>
-        <w:t>: {kabKota}</w:t>
-      </w:r>
-    </w:p>
-    <w:p>
-      <w:pPr>
-        <w:spacing w:after="0" w:line="360" w:lineRule="auto"/>
-        <w:jc w:val="both"/>
-        <w:rPr>
-          <w:rFonts w:ascii="Bookman Old Style" w:eastAsia="Bookman Old Style" w:hAnsi="Bookman Old Style" w:cs="Bookman Old Style"/>
-          <w:sz w:val="24"/>
-          <w:szCs w:val="24"/>
-        </w:rPr>
-      </w:pPr>
-      <w:r>
-        <w:rPr>
-          <w:rFonts w:ascii="Bookman Old Style" w:eastAsia="Bookman Old Style" w:hAnsi="Bookman Old Style" w:cs="Bookman Old Style"/>
-          <w:sz w:val="24"/>
-          <w:szCs w:val="24"/>
-        </w:rPr>
-        <w:t>Nomor Handphone</w:t>
-      </w:r>
-      <w:r>
-        <w:rPr>
-          <w:rFonts w:ascii="Bookman Old Style" w:eastAsia="Bookman Old Style" w:hAnsi="Bookman Old Style" w:cs="Bookman Old Style"/>
-          <w:sz w:val="24"/>
-          <w:szCs w:val="24"/>
-        </w:rPr>
-        <w:tab/>
-        <w:t>: {noHp}</w:t>
-      </w:r>
-    </w:p>
+    <w:tbl>
+      <w:tblPr>
+        <w:tblW w:w="9639" w:type="dxa"/>
+        <w:tblInd w:w="0" w:type="dxa"/>
+        <w:tblLayout w:type="fixed"/>
+        <w:tblBorders>
+          <w:top w:val="nil"/>
+          <w:left w:val="nil"/>
+          <w:bottom w:val="nil"/>
+          <w:right w:val="nil"/>
+          <w:insideH w:val="nil"/>
+          <w:insideV w:val="nil"/>
+        </w:tblBorders>
+      </w:tblPr>
+      <w:tblGrid>
+        <w:gridCol w:w="2700"/>
+        <w:gridCol w:w="220"/>
+        <w:gridCol w:w="6719"/>
+      </w:tblGrid>
+      <w:tr>
+        <w:trPr>
+          <w:cantSplit/>
+        </w:trPr>
+        <w:tc>
+          <w:tcPr>
+            <w:tcW w:w="2700" w:type="dxa"/>
+            <w:tcMar>
+              <w:top w:w="0" w:type="dxa"/>
+              <w:left w:w="0" w:type="dxa"/>
+              <w:bottom w:w="0" w:type="dxa"/>
+              <w:right w:w="0" w:type="dxa"/>
+            </w:tcMar>
+            <w:vAlign w:val="top"/>
+          </w:tcPr>
+          <w:p>
+            <w:pPr>
+              <w:spacing w:before="0" w:after="0" w:line="360" w:lineRule="auto"/>
+              <w:jc w:val="left"/>
+            </w:pPr>
+            <w:r>
+              <w:rPr>
+                <w:rFonts w:ascii="Bookman Old Style" w:hAnsi="Bookman Old Style" w:eastAsia="Bookman Old Style" w:cs="Bookman Old Style"/>
+                <w:sz w:val="24"/>
+                <w:szCs w:val="24"/>
+                <w:color w:val="000000"/>
+              </w:rPr>
+              <w:t xml:space="preserve">Nama</w:t>
+            </w:r>
+          </w:p>
+        </w:tc>
+        <w:tc>
+          <w:tcPr>
+            <w:tcW w:w="220" w:type="dxa"/>
+            <w:tcMar>
+              <w:top w:w="0" w:type="dxa"/>
+              <w:left w:w="0" w:type="dxa"/>
+              <w:bottom w:w="0" w:type="dxa"/>
+              <w:right w:w="0" w:type="dxa"/>
+            </w:tcMar>
+            <w:vAlign w:val="top"/>
+          </w:tcPr>
+          <w:p>
+            <w:pPr>
+              <w:spacing w:before="0" w:after="0" w:line="360" w:lineRule="auto"/>
+              <w:jc w:val="left"/>
+            </w:pPr>
+            <w:r>
+              <w:rPr>
+                <w:rFonts w:ascii="Bookman Old Style" w:hAnsi="Bookman Old Style" w:eastAsia="Bookman Old Style" w:cs="Bookman Old Style"/>
+                <w:sz w:val="24"/>
+                <w:szCs w:val="24"/>
+                <w:color w:val="000000"/>
+              </w:rPr>
+              <w:t xml:space="preserve">:</w:t>
+            </w:r>
+          </w:p>
+        </w:tc>
+        <w:tc>
+          <w:tcPr>
+            <w:tcW w:w="6719" w:type="dxa"/>
+            <w:tcMar>
+              <w:top w:w="0" w:type="dxa"/>
+              <w:left w:w="0" w:type="dxa"/>
+              <w:bottom w:w="0" w:type="dxa"/>
+              <w:right w:w="0" w:type="dxa"/>
+            </w:tcMar>
+            <w:vAlign w:val="top"/>
+          </w:tcPr>
+          <w:p>
+            <w:pPr>
+              <w:spacing w:before="0" w:after="0" w:line="360" w:lineRule="auto"/>
+              <w:jc w:val="left"/>
+            </w:pPr>
+            <w:r>
+              <w:rPr>
+                <w:rFonts w:ascii="Bookman Old Style" w:hAnsi="Bookman Old Style" w:eastAsia="Bookman Old Style" w:cs="Bookman Old Style"/>
+                <w:sz w:val="24"/>
+                <w:szCs w:val="24"/>
+                <w:color w:val="000000"/>
+              </w:rPr>
+              <w:t xml:space="preserve">{nama}</w:t>
+            </w:r>
+          </w:p>
+        </w:tc>
+      </w:tr>
+      <w:tr>
+        <w:trPr>
+          <w:cantSplit/>
+        </w:trPr>
+        <w:tc>
+          <w:tcPr>
+            <w:tcW w:w="2700" w:type="dxa"/>
+            <w:tcMar>
+              <w:top w:w="0" w:type="dxa"/>
+              <w:left w:w="0" w:type="dxa"/>
+              <w:bottom w:w="0" w:type="dxa"/>
+              <w:right w:w="0" w:type="dxa"/>
+            </w:tcMar>
+            <w:vAlign w:val="top"/>
+          </w:tcPr>
+          <w:p>
+            <w:pPr>
+              <w:spacing w:before="0" w:after="0" w:line="360" w:lineRule="auto"/>
+              <w:jc w:val="left"/>
+            </w:pPr>
+            <w:r>
+              <w:rPr>
+                <w:rFonts w:ascii="Bookman Old Style" w:hAnsi="Bookman Old Style" w:eastAsia="Bookman Old Style" w:cs="Bookman Old Style"/>
+                <w:sz w:val="24"/>
+                <w:szCs w:val="24"/>
+                <w:color w:val="000000"/>
+              </w:rPr>
+              <w:t xml:space="preserve">NIP</w:t>
+            </w:r>
+          </w:p>
+        </w:tc>
+        <w:tc>
+          <w:tcPr>
+            <w:tcW w:w="220" w:type="dxa"/>
+            <w:tcMar>
+              <w:top w:w="0" w:type="dxa"/>
+              <w:left w:w="0" w:type="dxa"/>
+              <w:bottom w:w="0" w:type="dxa"/>
+              <w:right w:w="0" w:type="dxa"/>
+            </w:tcMar>
+            <w:vAlign w:val="top"/>
+          </w:tcPr>
+          <w:p>
+            <w:pPr>
+              <w:spacing w:before="0" w:after="0" w:line="360" w:lineRule="auto"/>
+              <w:jc w:val="left"/>
+            </w:pPr>
+            <w:r>
+              <w:rPr>
+                <w:rFonts w:ascii="Bookman Old Style" w:hAnsi="Bookman Old Style" w:eastAsia="Bookman Old Style" w:cs="Bookman Old Style"/>
+                <w:sz w:val="24"/>
+                <w:szCs w:val="24"/>
+                <w:color w:val="000000"/>
+              </w:rPr>
+              <w:t xml:space="preserve">:</w:t>
+            </w:r>
+          </w:p>
+        </w:tc>
+        <w:tc>
+          <w:tcPr>
+            <w:tcW w:w="6719" w:type="dxa"/>
+            <w:tcMar>
+              <w:top w:w="0" w:type="dxa"/>
+              <w:left w:w="0" w:type="dxa"/>
+              <w:bottom w:w="0" w:type="dxa"/>
+              <w:right w:w="0" w:type="dxa"/>
+            </w:tcMar>
+            <w:vAlign w:val="top"/>
+          </w:tcPr>
+          <w:p>
+            <w:pPr>
+              <w:spacing w:before="0" w:after="0" w:line="360" w:lineRule="auto"/>
+              <w:jc w:val="left"/>
+            </w:pPr>
+            <w:r>
+              <w:rPr>
+                <w:rFonts w:ascii="Bookman Old Style" w:hAnsi="Bookman Old Style" w:eastAsia="Bookman Old Style" w:cs="Bookman Old Style"/>
+                <w:sz w:val="24"/>
+                <w:szCs w:val="24"/>
+                <w:color w:val="000000"/>
+              </w:rPr>
+              <w:t xml:space="preserve">{nip}</w:t>
+            </w:r>
+          </w:p>
+        </w:tc>
+      </w:tr>
+      <w:tr>
+        <w:trPr>
+          <w:cantSplit/>
+        </w:trPr>
+        <w:tc>
+          <w:tcPr>
+            <w:tcW w:w="2700" w:type="dxa"/>
+            <w:tcMar>
+              <w:top w:w="0" w:type="dxa"/>
+              <w:left w:w="0" w:type="dxa"/>
+              <w:bottom w:w="0" w:type="dxa"/>
+              <w:right w:w="0" w:type="dxa"/>
+            </w:tcMar>
+            <w:vAlign w:val="top"/>
+          </w:tcPr>
+          <w:p>
+            <w:pPr>
+              <w:spacing w:before="0" w:after="0" w:line="360" w:lineRule="auto"/>
+              <w:jc w:val="left"/>
+            </w:pPr>
+            <w:r>
+              <w:rPr>
+                <w:rFonts w:ascii="Bookman Old Style" w:hAnsi="Bookman Old Style" w:eastAsia="Bookman Old Style" w:cs="Bookman Old Style"/>
+                <w:sz w:val="24"/>
+                <w:szCs w:val="24"/>
+                <w:color w:val="000000"/>
+              </w:rPr>
+              <w:t xml:space="preserve">NIK</w:t>
+            </w:r>
+          </w:p>
+        </w:tc>
+        <w:tc>
+          <w:tcPr>
+            <w:tcW w:w="220" w:type="dxa"/>
+            <w:tcMar>
+              <w:top w:w="0" w:type="dxa"/>
+              <w:left w:w="0" w:type="dxa"/>
+              <w:bottom w:w="0" w:type="dxa"/>
+              <w:right w:w="0" w:type="dxa"/>
+            </w:tcMar>
+            <w:vAlign w:val="top"/>
+          </w:tcPr>
+          <w:p>
+            <w:pPr>
+              <w:spacing w:before="0" w:after="0" w:line="360" w:lineRule="auto"/>
+              <w:jc w:val="left"/>
+            </w:pPr>
+            <w:r>
+              <w:rPr>
+                <w:rFonts w:ascii="Bookman Old Style" w:hAnsi="Bookman Old Style" w:eastAsia="Bookman Old Style" w:cs="Bookman Old Style"/>
+                <w:sz w:val="24"/>
+                <w:szCs w:val="24"/>
+                <w:color w:val="000000"/>
+              </w:rPr>
+              <w:t xml:space="preserve">:</w:t>
+            </w:r>
+          </w:p>
+        </w:tc>
+        <w:tc>
+          <w:tcPr>
+            <w:tcW w:w="6719" w:type="dxa"/>
+            <w:tcMar>
+              <w:top w:w="0" w:type="dxa"/>
+              <w:left w:w="0" w:type="dxa"/>
+              <w:bottom w:w="0" w:type="dxa"/>
+              <w:right w:w="0" w:type="dxa"/>
+            </w:tcMar>
+            <w:vAlign w:val="top"/>
+          </w:tcPr>
+          <w:p>
+            <w:pPr>
+              <w:spacing w:before="0" w:after="0" w:line="360" w:lineRule="auto"/>
+              <w:jc w:val="left"/>
+            </w:pPr>
+            <w:r>
+              <w:rPr>
+                <w:rFonts w:ascii="Bookman Old Style" w:hAnsi="Bookman Old Style" w:eastAsia="Bookman Old Style" w:cs="Bookman Old Style"/>
+                <w:sz w:val="24"/>
+                <w:szCs w:val="24"/>
+                <w:color w:val="000000"/>
+              </w:rPr>
+              <w:t xml:space="preserve">{nik}</w:t>
+            </w:r>
+          </w:p>
+        </w:tc>
+      </w:tr>
+      <w:tr>
+        <w:trPr>
+          <w:cantSplit/>
+        </w:trPr>
+        <w:tc>
+          <w:tcPr>
+            <w:tcW w:w="2700" w:type="dxa"/>
+            <w:tcMar>
+              <w:top w:w="0" w:type="dxa"/>
+              <w:left w:w="0" w:type="dxa"/>
+              <w:bottom w:w="0" w:type="dxa"/>
+              <w:right w:w="0" w:type="dxa"/>
+            </w:tcMar>
+            <w:vAlign w:val="top"/>
+          </w:tcPr>
+          <w:p>
+            <w:pPr>
+              <w:spacing w:before="0" w:after="0" w:line="360" w:lineRule="auto"/>
+              <w:jc w:val="left"/>
+            </w:pPr>
+            <w:r>
+              <w:rPr>
+                <w:rFonts w:ascii="Bookman Old Style" w:hAnsi="Bookman Old Style" w:eastAsia="Bookman Old Style" w:cs="Bookman Old Style"/>
+                <w:sz w:val="24"/>
+                <w:szCs w:val="24"/>
+                <w:color w:val="000000"/>
+              </w:rPr>
+              <w:t xml:space="preserve">Jabatan</w:t>
+            </w:r>
+          </w:p>
+        </w:tc>
+        <w:tc>
+          <w:tcPr>
+            <w:tcW w:w="220" w:type="dxa"/>
+            <w:tcMar>
+              <w:top w:w="0" w:type="dxa"/>
+              <w:left w:w="0" w:type="dxa"/>
+              <w:bottom w:w="0" w:type="dxa"/>
+              <w:right w:w="0" w:type="dxa"/>
+            </w:tcMar>
+            <w:vAlign w:val="top"/>
+          </w:tcPr>
+          <w:p>
+            <w:pPr>
+              <w:spacing w:before="0" w:after="0" w:line="360" w:lineRule="auto"/>
+              <w:jc w:val="left"/>
+            </w:pPr>
+            <w:r>
+              <w:rPr>
+                <w:rFonts w:ascii="Bookman Old Style" w:hAnsi="Bookman Old Style" w:eastAsia="Bookman Old Style" w:cs="Bookman Old Style"/>
+                <w:sz w:val="24"/>
+                <w:szCs w:val="24"/>
+                <w:color w:val="000000"/>
+              </w:rPr>
+              <w:t xml:space="preserve">:</w:t>
+            </w:r>
+          </w:p>
+        </w:tc>
+        <w:tc>
+          <w:tcPr>
+            <w:tcW w:w="6719" w:type="dxa"/>
+            <w:tcMar>
+              <w:top w:w="0" w:type="dxa"/>
+              <w:left w:w="0" w:type="dxa"/>
+              <w:bottom w:w="0" w:type="dxa"/>
+              <w:right w:w="0" w:type="dxa"/>
+            </w:tcMar>
+            <w:vAlign w:val="top"/>
+          </w:tcPr>
+          <w:p>
+            <w:pPr>
+              <w:spacing w:before="0" w:after="0" w:line="360" w:lineRule="auto"/>
+              <w:jc w:val="left"/>
+            </w:pPr>
+            <w:r>
+              <w:rPr>
+                <w:rFonts w:ascii="Bookman Old Style" w:hAnsi="Bookman Old Style" w:eastAsia="Bookman Old Style" w:cs="Bookman Old Style"/>
+                <w:sz w:val="24"/>
+                <w:szCs w:val="24"/>
+                <w:color w:val="000000"/>
+              </w:rPr>
+              <w:t xml:space="preserve">{jabatan}</w:t>
+            </w:r>
+          </w:p>
+        </w:tc>
+      </w:tr>
+      <w:tr>
+        <w:trPr>
+          <w:cantSplit/>
+        </w:trPr>
+        <w:tc>
+          <w:tcPr>
+            <w:tcW w:w="2700" w:type="dxa"/>
+            <w:tcMar>
+              <w:top w:w="0" w:type="dxa"/>
+              <w:left w:w="0" w:type="dxa"/>
+              <w:bottom w:w="0" w:type="dxa"/>
+              <w:right w:w="0" w:type="dxa"/>
+            </w:tcMar>
+            <w:vAlign w:val="top"/>
+          </w:tcPr>
+          <w:p>
+            <w:pPr>
+              <w:spacing w:before="0" w:after="0" w:line="360" w:lineRule="auto"/>
+              <w:jc w:val="left"/>
+            </w:pPr>
+            <w:r>
+              <w:rPr>
+                <w:rFonts w:ascii="Bookman Old Style" w:hAnsi="Bookman Old Style" w:eastAsia="Bookman Old Style" w:cs="Bookman Old Style"/>
+                <w:sz w:val="24"/>
+                <w:szCs w:val="24"/>
+                <w:color w:val="000000"/>
+              </w:rPr>
+              <w:t xml:space="preserve">Unit Kerja</w:t>
+            </w:r>
+          </w:p>
+        </w:tc>
+        <w:tc>
+          <w:tcPr>
+            <w:tcW w:w="220" w:type="dxa"/>
+            <w:tcMar>
+              <w:top w:w="0" w:type="dxa"/>
+              <w:left w:w="0" w:type="dxa"/>
+              <w:bottom w:w="0" w:type="dxa"/>
+              <w:right w:w="0" w:type="dxa"/>
+            </w:tcMar>
+            <w:vAlign w:val="top"/>
+          </w:tcPr>
+          <w:p>
+            <w:pPr>
+              <w:spacing w:before="0" w:after="0" w:line="360" w:lineRule="auto"/>
+              <w:jc w:val="left"/>
+            </w:pPr>
+            <w:r>
+              <w:rPr>
+                <w:rFonts w:ascii="Bookman Old Style" w:hAnsi="Bookman Old Style" w:eastAsia="Bookman Old Style" w:cs="Bookman Old Style"/>
+                <w:sz w:val="24"/>
+                <w:szCs w:val="24"/>
+                <w:color w:val="000000"/>
+              </w:rPr>
+              <w:t xml:space="preserve">:</w:t>
+            </w:r>
+          </w:p>
+        </w:tc>
+        <w:tc>
+          <w:tcPr>
+            <w:tcW w:w="6719" w:type="dxa"/>
+            <w:tcMar>
+              <w:top w:w="0" w:type="dxa"/>
+              <w:left w:w="0" w:type="dxa"/>
+              <w:bottom w:w="0" w:type="dxa"/>
+              <w:right w:w="0" w:type="dxa"/>
+            </w:tcMar>
+            <w:vAlign w:val="top"/>
+          </w:tcPr>
+          <w:p>
+            <w:pPr>
+              <w:spacing w:before="0" w:after="0" w:line="360" w:lineRule="auto"/>
+              <w:jc w:val="left"/>
+            </w:pPr>
+            <w:r>
+              <w:rPr>
+                <w:rFonts w:ascii="Bookman Old Style" w:hAnsi="Bookman Old Style" w:eastAsia="Bookman Old Style" w:cs="Bookman Old Style"/>
+                <w:sz w:val="24"/>
+                <w:szCs w:val="24"/>
+                <w:color w:val="000000"/>
+              </w:rPr>
+              <w:t xml:space="preserve">{unitKerja}</w:t>
+            </w:r>
+          </w:p>
+        </w:tc>
+      </w:tr>
+      <w:tr>
+        <w:trPr>
+          <w:cantSplit/>
+        </w:trPr>
+        <w:tc>
+          <w:tcPr>
+            <w:tcW w:w="2700" w:type="dxa"/>
+            <w:tcMar>
+              <w:top w:w="0" w:type="dxa"/>
+              <w:left w:w="0" w:type="dxa"/>
+              <w:bottom w:w="0" w:type="dxa"/>
+              <w:right w:w="0" w:type="dxa"/>
+            </w:tcMar>
+            <w:vAlign w:val="top"/>
+          </w:tcPr>
+          <w:p>
+            <w:pPr>
+              <w:spacing w:before="0" w:after="0" w:line="360" w:lineRule="auto"/>
+              <w:jc w:val="left"/>
+            </w:pPr>
+            <w:r>
+              <w:rPr>
+                <w:rFonts w:ascii="Bookman Old Style" w:hAnsi="Bookman Old Style" w:eastAsia="Bookman Old Style" w:cs="Bookman Old Style"/>
+                <w:sz w:val="24"/>
+                <w:szCs w:val="24"/>
+                <w:color w:val="000000"/>
+              </w:rPr>
+              <w:t xml:space="preserve">Provinsi</w:t>
+            </w:r>
+          </w:p>
+        </w:tc>
+        <w:tc>
+          <w:tcPr>
+            <w:tcW w:w="220" w:type="dxa"/>
+            <w:tcMar>
+              <w:top w:w="0" w:type="dxa"/>
+              <w:left w:w="0" w:type="dxa"/>
+              <w:bottom w:w="0" w:type="dxa"/>
+              <w:right w:w="0" w:type="dxa"/>
+            </w:tcMar>
+            <w:vAlign w:val="top"/>
+          </w:tcPr>
+          <w:p>
+            <w:pPr>
+              <w:spacing w:before="0" w:after="0" w:line="360" w:lineRule="auto"/>
+              <w:jc w:val="left"/>
+            </w:pPr>
+            <w:r>
+              <w:rPr>
+                <w:rFonts w:ascii="Bookman Old Style" w:hAnsi="Bookman Old Style" w:eastAsia="Bookman Old Style" w:cs="Bookman Old Style"/>
+                <w:sz w:val="24"/>
+                <w:szCs w:val="24"/>
+                <w:color w:val="000000"/>
+              </w:rPr>
+              <w:t xml:space="preserve">:</w:t>
+            </w:r>
+          </w:p>
+        </w:tc>
+        <w:tc>
+          <w:tcPr>
+            <w:tcW w:w="6719" w:type="dxa"/>
+            <w:tcMar>
+              <w:top w:w="0" w:type="dxa"/>
+              <w:left w:w="0" w:type="dxa"/>
+              <w:bottom w:w="0" w:type="dxa"/>
+              <w:right w:w="0" w:type="dxa"/>
+            </w:tcMar>
+            <w:vAlign w:val="top"/>
+          </w:tcPr>
+          <w:p>
+            <w:pPr>
+              <w:spacing w:before="0" w:after="0" w:line="360" w:lineRule="auto"/>
+              <w:jc w:val="left"/>
+            </w:pPr>
+            <w:r>
+              <w:rPr>
+                <w:rFonts w:ascii="Bookman Old Style" w:hAnsi="Bookman Old Style" w:eastAsia="Bookman Old Style" w:cs="Bookman Old Style"/>
+                <w:sz w:val="24"/>
+                <w:szCs w:val="24"/>
+                <w:color w:val="000000"/>
+              </w:rPr>
+              <w:t xml:space="preserve">{provinsi}</w:t>
+            </w:r>
+          </w:p>
+        </w:tc>
+      </w:tr>
+      <w:tr>
+        <w:trPr>
+          <w:cantSplit/>
+        </w:trPr>
+        <w:tc>
+          <w:tcPr>
+            <w:tcW w:w="2700" w:type="dxa"/>
+            <w:tcMar>
+              <w:top w:w="0" w:type="dxa"/>
+              <w:left w:w="0" w:type="dxa"/>
+              <w:bottom w:w="0" w:type="dxa"/>
+              <w:right w:w="0" w:type="dxa"/>
+            </w:tcMar>
+            <w:vAlign w:val="top"/>
+          </w:tcPr>
+          <w:p>
+            <w:pPr>
+              <w:spacing w:before="0" w:after="0" w:line="360" w:lineRule="auto"/>
+              <w:jc w:val="left"/>
+            </w:pPr>
+            <w:r>
+              <w:rPr>
+                <w:rFonts w:ascii="Bookman Old Style" w:hAnsi="Bookman Old Style" w:eastAsia="Bookman Old Style" w:cs="Bookman Old Style"/>
+                <w:sz w:val="24"/>
+                <w:szCs w:val="24"/>
+                <w:color w:val="000000"/>
+              </w:rPr>
+              <w:t xml:space="preserve">Kabupaten/Kota</w:t>
+            </w:r>
+          </w:p>
+        </w:tc>
+        <w:tc>
+          <w:tcPr>
+            <w:tcW w:w="220" w:type="dxa"/>
+            <w:tcMar>
+              <w:top w:w="0" w:type="dxa"/>
+              <w:left w:w="0" w:type="dxa"/>
+              <w:bottom w:w="0" w:type="dxa"/>
+              <w:right w:w="0" w:type="dxa"/>
+            </w:tcMar>
+            <w:vAlign w:val="top"/>
+          </w:tcPr>
+          <w:p>
+            <w:pPr>
+              <w:spacing w:before="0" w:after="0" w:line="360" w:lineRule="auto"/>
+              <w:jc w:val="left"/>
+            </w:pPr>
+            <w:r>
+              <w:rPr>
+                <w:rFonts w:ascii="Bookman Old Style" w:hAnsi="Bookman Old Style" w:eastAsia="Bookman Old Style" w:cs="Bookman Old Style"/>
+                <w:sz w:val="24"/>
+                <w:szCs w:val="24"/>
+                <w:color w:val="000000"/>
+              </w:rPr>
+              <w:t xml:space="preserve">:</w:t>
+            </w:r>
+          </w:p>
+        </w:tc>
+        <w:tc>
+          <w:tcPr>
+            <w:tcW w:w="6719" w:type="dxa"/>
+            <w:tcMar>
+              <w:top w:w="0" w:type="dxa"/>
+              <w:left w:w="0" w:type="dxa"/>
+              <w:bottom w:w="0" w:type="dxa"/>
+              <w:right w:w="0" w:type="dxa"/>
+            </w:tcMar>
+            <w:vAlign w:val="top"/>
+          </w:tcPr>
+          <w:p>
+            <w:pPr>
+              <w:spacing w:before="0" w:after="0" w:line="360" w:lineRule="auto"/>
+              <w:jc w:val="left"/>
+            </w:pPr>
+            <w:r>
+              <w:rPr>
+                <w:rFonts w:ascii="Bookman Old Style" w:hAnsi="Bookman Old Style" w:eastAsia="Bookman Old Style" w:cs="Bookman Old Style"/>
+                <w:sz w:val="24"/>
+                <w:szCs w:val="24"/>
+                <w:color w:val="000000"/>
+              </w:rPr>
+              <w:t xml:space="preserve">{kabKota}</w:t>
+            </w:r>
+          </w:p>
+        </w:tc>
+      </w:tr>
+      <w:tr>
+        <w:trPr>
+          <w:cantSplit/>
+        </w:trPr>
+        <w:tc>
+          <w:tcPr>
+            <w:tcW w:w="2700" w:type="dxa"/>
+            <w:tcMar>
+              <w:top w:w="0" w:type="dxa"/>
+              <w:left w:w="0" w:type="dxa"/>
+              <w:bottom w:w="0" w:type="dxa"/>
+              <w:right w:w="0" w:type="dxa"/>
+            </w:tcMar>
+            <w:vAlign w:val="top"/>
+          </w:tcPr>
+          <w:p>
+            <w:pPr>
+              <w:spacing w:before="0" w:after="0" w:line="360" w:lineRule="auto"/>
+              <w:jc w:val="left"/>
+            </w:pPr>
+            <w:r>
+              <w:rPr>
+                <w:rFonts w:ascii="Bookman Old Style" w:hAnsi="Bookman Old Style" w:eastAsia="Bookman Old Style" w:cs="Bookman Old Style"/>
+                <w:sz w:val="24"/>
+                <w:szCs w:val="24"/>
+                <w:color w:val="000000"/>
+              </w:rPr>
+              <w:t xml:space="preserve">Nomor Handphone</w:t>
+            </w:r>
+          </w:p>
+        </w:tc>
+        <w:tc>
+          <w:tcPr>
+            <w:tcW w:w="220" w:type="dxa"/>
+            <w:tcMar>
+              <w:top w:w="0" w:type="dxa"/>
+              <w:left w:w="0" w:type="dxa"/>
+              <w:bottom w:w="0" w:type="dxa"/>
+              <w:right w:w="0" w:type="dxa"/>
+            </w:tcMar>
+            <w:vAlign w:val="top"/>
+          </w:tcPr>
+          <w:p>
+            <w:pPr>
+              <w:spacing w:before="0" w:after="0" w:line="360" w:lineRule="auto"/>
+              <w:jc w:val="left"/>
+            </w:pPr>
+            <w:r>
+              <w:rPr>
+                <w:rFonts w:ascii="Bookman Old Style" w:hAnsi="Bookman Old Style" w:eastAsia="Bookman Old Style" w:cs="Bookman Old Style"/>
+                <w:sz w:val="24"/>
+                <w:szCs w:val="24"/>
+                <w:color w:val="000000"/>
+              </w:rPr>
+              <w:t xml:space="preserve">:</w:t>
+            </w:r>
+          </w:p>
+        </w:tc>
+        <w:tc>
+          <w:tcPr>
+            <w:tcW w:w="6719" w:type="dxa"/>
+            <w:tcMar>
+              <w:top w:w="0" w:type="dxa"/>
+              <w:left w:w="0" w:type="dxa"/>
+              <w:bottom w:w="0" w:type="dxa"/>
+              <w:right w:w="0" w:type="dxa"/>
+            </w:tcMar>
+            <w:vAlign w:val="top"/>
+          </w:tcPr>
+          <w:p>
+            <w:pPr>
+              <w:spacing w:before="0" w:after="0" w:line="360" w:lineRule="auto"/>
+              <w:jc w:val="left"/>
+            </w:pPr>
+            <w:r>
+              <w:rPr>
+                <w:rFonts w:ascii="Bookman Old Style" w:hAnsi="Bookman Old Style" w:eastAsia="Bookman Old Style" w:cs="Bookman Old Style"/>
+                <w:sz w:val="24"/>
+                <w:szCs w:val="24"/>
+                <w:color w:val="000000"/>
+              </w:rPr>
+              <w:t xml:space="preserve">{noHp}</w:t>
+            </w:r>
+          </w:p>
+        </w:tc>
+      </w:tr>
+    </w:tbl>
     <w:p>
       <w:pPr>
         <w:spacing w:before="120" w:after="0" w:line="360" w:lineRule="auto"/>

</xml_diff>